<commit_message>
Add Grad-CAM figures and section 4.7 to manuscript
- Added figures/gradcam_plantvillage.png, gradcam_deepweeds.png,
  gradcam_ip102.png (4 image pairs per dataset, original + Grad-CAM)
- Added section 4.7 Grad-CAM qualitative analysis to manuscript with
  placeholders [FIGURE 8], [FIGURE 9], [FIGURE 10] for PV, DW, IP102
- Manuscript now has 10 figure placeholders (1-10)

Co-Authored-By: Claude Sonnet 4.6 <noreply@anthropic.com>
Claude-Session: https://claude.ai/code/session_01K85NWP7R46292eL9EDr4Dm
</commit_message>
<xml_diff>
--- a/AgroOnto-VLM_Manuscript_Q1_f1.docx
+++ b/AgroOnto-VLM_Manuscript_Q1_f1.docx
@@ -3949,6 +3949,101 @@
       <w:r>
         <w:rPr>
           <w:b/>
+          <w:sz w:val="22"/>
+        </w:rPr>
+        <w:t>4.7. Grad-CAM qualitative analysis</w:t>
+      </w:r>
+    </w:p>
+    <w:p>
+      <w:pPr>
+        <w:spacing w:before="0" w:after="120" w:line="480" w:lineRule="auto"/>
+      </w:pPr>
+      <w:r>
+        <w:rPr>
+          <w:sz w:val="22"/>
+        </w:rPr>
+        <w:t>To qualitatively assess what features AgroOnto-VLM attends to, Grad-CAM attention maps are computed for representative samples from all three datasets. Figs. 8–10 show original images alongside their corresponding Grad-CAM overlays, illustrating the spatial regions most responsible for the model’s predictions.</w:t>
+      </w:r>
+    </w:p>
+    <w:p>
+      <w:pPr>
+        <w:spacing w:before="240"/>
+      </w:pPr>
+      <w:r>
+        <w:rPr>
+          <w:b/>
+          <w:color w:val="808080"/>
+        </w:rPr>
+        <w:t>[FIGURE 8 HERE]</w:t>
+      </w:r>
+    </w:p>
+    <w:p>
+      <w:pPr>
+        <w:spacing w:before="80" w:after="120"/>
+      </w:pPr>
+      <w:r>
+        <w:rPr>
+          <w:i/>
+          <w:sz w:val="20"/>
+        </w:rPr>
+        <w:t>Fig. 8. Grad-CAM attention maps — AgroOnto-VLM on PlantVillage Tomato. Left: original images. Right: Grad-CAM overlay (red = high activation). The model correctly localises lesion regions for Early Blight, Bacterial Spot, and Tomato Yellow Leaf Curl Virus, confirming disease-specific feature discrimination.</w:t>
+      </w:r>
+    </w:p>
+    <w:p>
+      <w:pPr>
+        <w:spacing w:before="240"/>
+      </w:pPr>
+      <w:r>
+        <w:rPr>
+          <w:b/>
+          <w:color w:val="808080"/>
+        </w:rPr>
+        <w:t>[FIGURE 9 HERE]</w:t>
+      </w:r>
+    </w:p>
+    <w:p>
+      <w:pPr>
+        <w:spacing w:before="80" w:after="120"/>
+      </w:pPr>
+      <w:r>
+        <w:rPr>
+          <w:i/>
+          <w:sz w:val="20"/>
+        </w:rPr>
+        <w:t>Fig. 9. Grad-CAM attention maps — AgroOnto-VLM on DeepWeeds. The model focuses on distinctive leaf morphology and plant structure. The Chinee Apple example shows activation concentrated on characteristic leaf clusters despite visual similarity to background vegetation.</w:t>
+      </w:r>
+    </w:p>
+    <w:p>
+      <w:pPr>
+        <w:spacing w:before="240"/>
+      </w:pPr>
+      <w:r>
+        <w:rPr>
+          <w:b/>
+          <w:color w:val="808080"/>
+        </w:rPr>
+        <w:t>[FIGURE 10 HERE]</w:t>
+      </w:r>
+    </w:p>
+    <w:p>
+      <w:pPr>
+        <w:spacing w:before="80" w:after="240"/>
+      </w:pPr>
+      <w:r>
+        <w:rPr>
+          <w:i/>
+          <w:sz w:val="20"/>
+        </w:rPr>
+        <w:t>Fig. 10. Grad-CAM attention maps — AgroOnto-VLM on IP102. Attention is concentrated on insect body features (wing patterns, body shape). Some examples show misclassification between visually similar pest species, consistent with the lower macro-F1 observed on this 102-class benchmark.</w:t>
+      </w:r>
+    </w:p>
+    <w:p>
+      <w:pPr>
+        <w:spacing w:before="240" w:after="80"/>
+      </w:pPr>
+      <w:r>
+        <w:rPr>
+          <w:b/>
           <w:sz w:val="24"/>
         </w:rPr>
         <w:t>5. Discussion</w:t>

</xml_diff>

<commit_message>
Remove architecture diagram placeholder, renumber figures 1-9
- Removed Fig. 1 (CLIP ViT-B/32 architecture diagram) placeholder and caption per author's request; paper focuses on proposed model, baselines, ablation, and SOTA comparison
- Renumbered all remaining figures: old Figs 2-10 become Figs 1-9
- Updated all in-text citations accordingly (Fig. 2 → Fig. 1, etc.)
- Corrected figure placeholders [FIGURE N HERE] to match adjacent captions
- Updated best accuracy values throughout: 98.84→99.55, 92.23→97.02, 70.88→76.60
- Added section 4.7 Grad-CAM qualitative analysis (Figs 7-9)

Co-Authored-By: Claude Sonnet 4.6 <noreply@anthropic.com>
Claude-Session: https://claude.ai/code/session_01K85NWP7R46292eL9EDr4Dm
</commit_message>
<xml_diff>
--- a/AgroOnto-VLM_Manuscript_Q1_f1.docx
+++ b/AgroOnto-VLM_Manuscript_Q1_f1.docx
@@ -377,30 +377,6 @@
           <w:sz w:val="22"/>
         </w:rPr>
         <w:t>AgroOnto-VLM adapts a frozen CLIP ViT-B/32 backbone to an agricultural classification task using two components: (1) low-rank adapters (LoRA) inserted into the attention layers of the final four transformer blocks, and (2) an ontology-guided composite training objective that embeds pairwise class similarities derived from a multi-faceted agricultural ontology into the supervision signal. At inference, only the LoRA-adapted CLIP image encoder is used; the ontology and the prototype regulariser are training-only components.</w:t>
-      </w:r>
-    </w:p>
-    <w:p>
-      <w:pPr>
-        <w:spacing w:before="240"/>
-      </w:pPr>
-      <w:r>
-        <w:rPr>
-          <w:b/>
-          <w:color w:val="808080"/>
-        </w:rPr>
-        <w:t>[FIGURE 1 HERE]</w:t>
-      </w:r>
-    </w:p>
-    <w:p>
-      <w:pPr>
-        <w:spacing w:before="80" w:after="240"/>
-      </w:pPr>
-      <w:r>
-        <w:rPr>
-          <w:i/>
-          <w:sz w:val="20"/>
-        </w:rPr>
-        <w:t>Fig. 1. System architecture of AgroOnto-VLM. The frozen CLIP ViT-B/32 image encoder is adapted via LoRA modules (rank r = 8) inserted into the query and value projections of the final four transformer blocks. During training, ontology-derived soft targets s_y and a prototype regulariser L_proto are computed from the multi-faceted agricultural ontology and combined with the hard label e_y and uniform smoothing term u to form the composite target q. At inference, the model is a standard image classifier.</w:t>
       </w:r>
     </w:p>
     <w:p>
@@ -2895,7 +2871,7 @@
           <w:b/>
           <w:color w:val="808080"/>
         </w:rPr>
-        <w:t>[FIGURE 7 HERE]</w:t>
+        <w:t>[FIGURE 6 HERE]</w:t>
       </w:r>
     </w:p>
     <w:p>
@@ -2907,7 +2883,7 @@
           <w:i/>
           <w:sz w:val="20"/>
         </w:rPr>
-        <w:t>Fig. 7. Multi-seed reproducibility. Top-1 test accuracy (%) across three random seeds (42, 123, 456) on PlantVillage tomato, DeepWeeds, and IP102. Horizontal line: per-dataset mean. Shaded band: ±1 std.</w:t>
+        <w:t>Fig. 6. Multi-seed reproducibility. Top-1 test accuracy (%) across three random seeds (42, 123, 456) on PlantVillage tomato, DeepWeeds, and IP102. Horizontal line: per-dataset mean. Shaded band: ±1 std.</w:t>
       </w:r>
     </w:p>
     <w:p>
@@ -3684,7 +3660,7 @@
           <w:b/>
           <w:color w:val="808080"/>
         </w:rPr>
-        <w:t>[FIGURE 6 HERE]</w:t>
+        <w:t>[FIGURE 5 HERE]</w:t>
       </w:r>
     </w:p>
     <w:p>
@@ -3696,7 +3672,7 @@
           <w:i/>
           <w:sz w:val="20"/>
         </w:rPr>
-        <w:t>Fig. 6. State-of-the-art comparison. Top-1 accuracy (%) on PlantVillage tomato (PV), DeepWeeds (DW), and IP102 for AgroOnto-VLM (red) versus published baselines. Protocol differences are noted in Table 5.</w:t>
+        <w:t>Fig. 5. State-of-the-art comparison. Top-1 accuracy (%) on PlantVillage tomato (PV), DeepWeeds (DW), and IP102 for AgroOnto-VLM (red) versus published baselines. Protocol differences are noted in Table 5.</w:t>
       </w:r>
     </w:p>
     <w:p>
@@ -3719,7 +3695,76 @@
         <w:rPr>
           <w:sz w:val="22"/>
         </w:rPr>
-        <w:t>Fig. 2 shows ablation results across all three datasets as grouped bar charts comparing AgroOnto-VLM, CLIP-LoRA Baseline, −Ontology Ablation, and −LoRA Ablation.</w:t>
+        <w:t>Fig. 1 shows ablation results across all three datasets as grouped bar charts comparing AgroOnto-VLM, CLIP-LoRA Baseline, −Ontology Ablation, and −LoRA Ablation.</w:t>
+      </w:r>
+    </w:p>
+    <w:p>
+      <w:pPr>
+        <w:spacing w:before="240"/>
+      </w:pPr>
+      <w:r>
+        <w:rPr>
+          <w:b/>
+          <w:color w:val="808080"/>
+        </w:rPr>
+        <w:t>[FIGURE 1 HERE]</w:t>
+      </w:r>
+    </w:p>
+    <w:p>
+      <w:pPr>
+        <w:spacing w:before="80" w:after="240"/>
+      </w:pPr>
+      <w:r>
+        <w:rPr>
+          <w:i/>
+          <w:sz w:val="20"/>
+        </w:rPr>
+        <w:t>Fig. 1. Ablation study results. Grouped bars show test accuracy (%) for AgroOnto-VLM (Proposed), CLIP-LoRA Baseline (−Ontology), −Ontology Ablation (label smooth only), and −LoRA Ablation (linear probe). Left to right: PlantVillage, DeepWeeds, IP102.</w:t>
+      </w:r>
+    </w:p>
+    <w:p>
+      <w:pPr>
+        <w:spacing w:before="0" w:after="120" w:line="480" w:lineRule="auto"/>
+      </w:pPr>
+      <w:r>
+        <w:rPr>
+          <w:sz w:val="22"/>
+        </w:rPr>
+        <w:t>The LoRA adapters provide the largest single contribution to accuracy. Removing them (−LoRA vs. CLIP-LoRA Baseline) reduces accuracy by 3.7 pp on PlantVillage, 13.7 pp on DeepWeeds, and 6.8 pp on IP102. This confirms the finding of Espejo-Garcia et al. (2025) that PEFT-adapted foundation models substantially outperform linear probes on agricultural benchmarks.</w:t>
+      </w:r>
+    </w:p>
+    <w:p>
+      <w:pPr>
+        <w:spacing w:before="0" w:after="120" w:line="480" w:lineRule="auto"/>
+      </w:pPr>
+      <w:r>
+        <w:rPr>
+          <w:sz w:val="22"/>
+        </w:rPr>
+        <w:t>The ontological supervision provides a consistent, smaller benefit over the label-smoothed baseline on PlantVillage (Δ ≈ +0.3 pp macro-F1) and IP102 (Δ ≈ −0.6 pp on accuracy but +0.5 pp on macro-F1), indicating a trade-off between overall accuracy and per-class equity that favours ontological supervision on the long-tail IP102. On DeepWeeds the label-smoothed baseline slightly outperforms the full ontological objective, suggesting that the facet assignments for weed classes are less aligned with visual discriminability in that domain.</w:t>
+      </w:r>
+    </w:p>
+    <w:p>
+      <w:pPr>
+        <w:spacing w:before="240" w:after="80"/>
+      </w:pPr>
+      <w:r>
+        <w:rPr>
+          <w:b/>
+          <w:sz w:val="22"/>
+        </w:rPr>
+        <w:t>4.4. Training convergence</w:t>
+      </w:r>
+    </w:p>
+    <w:p>
+      <w:pPr>
+        <w:spacing w:before="0" w:after="120" w:line="480" w:lineRule="auto"/>
+      </w:pPr>
+      <w:r>
+        <w:rPr>
+          <w:sz w:val="22"/>
+        </w:rPr>
+        <w:t>Fig. 2 shows training and validation loss and accuracy curves for AgroOnto-VLM across all three datasets. On PlantVillage and DeepWeeds, training loss decreases smoothly and validation accuracy plateaus within 15–20 epochs, indicating stable convergence without overfitting. On IP102, validation accuracy plateaus earlier (approximately epoch 10) while training loss continues to decrease, suggesting mild overfitting on the long-tail classes at later epochs.</w:t>
       </w:r>
     </w:p>
     <w:p>
@@ -3743,29 +3788,7 @@
           <w:i/>
           <w:sz w:val="20"/>
         </w:rPr>
-        <w:t>Fig. 2. Ablation study results. Grouped bars show test accuracy (%) for AgroOnto-VLM (Proposed), CLIP-LoRA Baseline (−Ontology), −Ontology Ablation (label smooth only), and −LoRA Ablation (linear probe). Left to right: PlantVillage, DeepWeeds, IP102.</w:t>
-      </w:r>
-    </w:p>
-    <w:p>
-      <w:pPr>
-        <w:spacing w:before="0" w:after="120" w:line="480" w:lineRule="auto"/>
-      </w:pPr>
-      <w:r>
-        <w:rPr>
-          <w:sz w:val="22"/>
-        </w:rPr>
-        <w:t>The LoRA adapters provide the largest single contribution to accuracy. Removing them (−LoRA vs. CLIP-LoRA Baseline) reduces accuracy by 3.7 pp on PlantVillage, 13.7 pp on DeepWeeds, and 6.8 pp on IP102. This confirms the finding of Espejo-Garcia et al. (2025) that PEFT-adapted foundation models substantially outperform linear probes on agricultural benchmarks.</w:t>
-      </w:r>
-    </w:p>
-    <w:p>
-      <w:pPr>
-        <w:spacing w:before="0" w:after="120" w:line="480" w:lineRule="auto"/>
-      </w:pPr>
-      <w:r>
-        <w:rPr>
-          <w:sz w:val="22"/>
-        </w:rPr>
-        <w:t>The ontological supervision provides a consistent, smaller benefit over the label-smoothed baseline on PlantVillage (Δ ≈ +0.3 pp macro-F1) and IP102 (Δ ≈ −0.6 pp on accuracy but +0.5 pp on macro-F1), indicating a trade-off between overall accuracy and per-class equity that favours ontological supervision on the long-tail IP102. On DeepWeeds the label-smoothed baseline slightly outperforms the full ontological objective, suggesting that the facet assignments for weed classes are less aligned with visual discriminability in that domain.</w:t>
+        <w:t>Fig. 2. Training convergence curves for AgroOnto-VLM. Top row: training and validation loss. Bottom row: training and validation accuracy. Columns (left to right): PlantVillage, DeepWeeds, IP102. Epoch axis: 0–30.</w:t>
       </w:r>
     </w:p>
     <w:p>
@@ -3777,7 +3800,7 @@
           <w:b/>
           <w:sz w:val="22"/>
         </w:rPr>
-        <w:t>4.4. Training convergence</w:t>
+        <w:t>4.5. Confusion matrices</w:t>
       </w:r>
     </w:p>
     <w:p>
@@ -3788,7 +3811,7 @@
         <w:rPr>
           <w:sz w:val="22"/>
         </w:rPr>
-        <w:t>Fig. 3 shows training and validation loss and accuracy curves for AgroOnto-VLM across all three datasets. On PlantVillage and DeepWeeds, training loss decreases smoothly and validation accuracy plateaus within 15–20 epochs, indicating stable convergence without overfitting. On IP102, validation accuracy plateaus earlier (approximately epoch 10) while training loss continues to decrease, suggesting mild overfitting on the long-tail classes at later epochs.</w:t>
+        <w:t>Fig. 3 shows normalised confusion matrices for AgroOnto-VLM on the three test sets. On PlantVillage tomato, the largest off-diagonal entry is between Tomato Late Blight and Tomato Early Blight, two classes that share host crop, organ, and symptom facets; this is the lowest-severity confusion pair in the ontology. On DeepWeeds, confusions cluster between visually similar species within the same growth-form group. On IP102, the confusion matrix is sparse at the class level but shows systematic confusion within insect order groups, consistent with the taxonomic facet structure.</w:t>
       </w:r>
     </w:p>
     <w:p>
@@ -3812,7 +3835,7 @@
           <w:i/>
           <w:sz w:val="20"/>
         </w:rPr>
-        <w:t>Fig. 3. Training convergence curves for AgroOnto-VLM. Top row: training and validation loss. Bottom row: training and validation accuracy. Columns (left to right): PlantVillage, DeepWeeds, IP102. Epoch axis: 0–30.</w:t>
+        <w:t>Fig. 3. Confusion matrices for AgroOnto-VLM. (a) PlantVillage tomato (10×10, normalised by row). (b) DeepWeeds (9×9, normalised by row). (c) IP102 (102×102, normalised by row; classes ordered by taxonomic order for readability).</w:t>
       </w:r>
     </w:p>
     <w:p>
@@ -3824,7 +3847,7 @@
           <w:b/>
           <w:sz w:val="22"/>
         </w:rPr>
-        <w:t>4.5. Confusion matrices</w:t>
+        <w:t>4.6. Misclassification severity</w:t>
       </w:r>
     </w:p>
     <w:p>
@@ -3835,7 +3858,7 @@
         <w:rPr>
           <w:sz w:val="22"/>
         </w:rPr>
-        <w:t>Fig. 4 shows normalised confusion matrices for AgroOnto-VLM on the three test sets. On PlantVillage tomato, the largest off-diagonal entry is between Tomato Late Blight and Tomato Early Blight, two classes that share host crop, organ, and symptom facets; this is the lowest-severity confusion pair in the ontology. On DeepWeeds, confusions cluster between visually similar species within the same growth-form group. On IP102, the confusion matrix is sparse at the class level but shows systematic confusion within insect order groups, consistent with the taxonomic facet structure.</w:t>
+        <w:t>Fig. 4 reports mean misclassification severity (Eq. 8) for AgroOnto-VLM and the CLIP-LoRA baseline, stratified by disease severity group (PlantVillage) and weed threat level (DeepWeeds).</w:t>
       </w:r>
     </w:p>
     <w:p>
@@ -3859,54 +3882,7 @@
           <w:i/>
           <w:sz w:val="20"/>
         </w:rPr>
-        <w:t>Fig. 4. Confusion matrices for AgroOnto-VLM. (a) PlantVillage tomato (10×10, normalised by row). (b) DeepWeeds (9×9, normalised by row). (c) IP102 (102×102, normalised by row; classes ordered by taxonomic order for readability).</w:t>
-      </w:r>
-    </w:p>
-    <w:p>
-      <w:pPr>
-        <w:spacing w:before="240" w:after="80"/>
-      </w:pPr>
-      <w:r>
-        <w:rPr>
-          <w:b/>
-          <w:sz w:val="22"/>
-        </w:rPr>
-        <w:t>4.6. Misclassification severity</w:t>
-      </w:r>
-    </w:p>
-    <w:p>
-      <w:pPr>
-        <w:spacing w:before="0" w:after="120" w:line="480" w:lineRule="auto"/>
-      </w:pPr>
-      <w:r>
-        <w:rPr>
-          <w:sz w:val="22"/>
-        </w:rPr>
-        <w:t>Fig. 5 reports mean misclassification severity (Eq. 8) for AgroOnto-VLM and the CLIP-LoRA baseline, stratified by disease severity group (PlantVillage) and weed threat level (DeepWeeds).</w:t>
-      </w:r>
-    </w:p>
-    <w:p>
-      <w:pPr>
-        <w:spacing w:before="240"/>
-      </w:pPr>
-      <w:r>
-        <w:rPr>
-          <w:b/>
-          <w:color w:val="808080"/>
-        </w:rPr>
-        <w:t>[FIGURE 5 HERE]</w:t>
-      </w:r>
-    </w:p>
-    <w:p>
-      <w:pPr>
-        <w:spacing w:before="80" w:after="240"/>
-      </w:pPr>
-      <w:r>
-        <w:rPr>
-          <w:i/>
-          <w:sz w:val="20"/>
-        </w:rPr>
-        <w:t>Fig. 5. Misclassification severity analysis. (a) PlantVillage tomato: accuracy across four disease severity strata (Healthy, Mild, Moderate, Severe). AgroOnto-VLM (blue) vs. CLIP-LoRA baseline (grey). (b) DeepWeeds: accuracy across weed threat level groups (Non-invasive, Low, Moderate, High threat). Error bars: ±1 std across three seeds.</w:t>
+        <w:t>Fig. 4. Misclassification severity analysis. (a) PlantVillage tomato: accuracy across four disease severity strata (Healthy, Mild, Moderate, Severe). AgroOnto-VLM (blue) vs. CLIP-LoRA baseline (grey). (b) DeepWeeds: accuracy across weed threat level groups (Non-invasive, Low, Moderate, High threat). Error bars: ±1 std across three seeds.</w:t>
       </w:r>
     </w:p>
     <w:p>
@@ -3974,7 +3950,7 @@
           <w:b/>
           <w:color w:val="808080"/>
         </w:rPr>
-        <w:t>[FIGURE 8 HERE]</w:t>
+        <w:t>[FIGURE 7 HERE]</w:t>
       </w:r>
     </w:p>
     <w:p>
@@ -3986,7 +3962,31 @@
           <w:i/>
           <w:sz w:val="20"/>
         </w:rPr>
-        <w:t>Fig. 8. Grad-CAM attention maps — AgroOnto-VLM on PlantVillage Tomato. Left: original images. Right: Grad-CAM overlay (red = high activation). The model correctly localises lesion regions for Early Blight, Bacterial Spot, and Tomato Yellow Leaf Curl Virus, confirming disease-specific feature discrimination.</w:t>
+        <w:t>Fig. 7. Grad-CAM attention maps — AgroOnto-VLM on PlantVillage Tomato. Left: original images. Right: Grad-CAM overlay (red = high activation). The model correctly localises lesion regions for Early Blight, Bacterial Spot, and Tomato Yellow Leaf Curl Virus, confirming disease-specific feature discrimination.</w:t>
+      </w:r>
+    </w:p>
+    <w:p>
+      <w:pPr>
+        <w:spacing w:before="240"/>
+      </w:pPr>
+      <w:r>
+        <w:rPr>
+          <w:b/>
+          <w:color w:val="808080"/>
+        </w:rPr>
+        <w:t>[FIGURE 8 HERE]</w:t>
+      </w:r>
+    </w:p>
+    <w:p>
+      <w:pPr>
+        <w:spacing w:before="80" w:after="120"/>
+      </w:pPr>
+      <w:r>
+        <w:rPr>
+          <w:i/>
+          <w:sz w:val="20"/>
+        </w:rPr>
+        <w:t>Fig. 8. Grad-CAM attention maps — AgroOnto-VLM on DeepWeeds. The model focuses on distinctive leaf morphology and plant structure. The Chinee Apple example shows activation concentrated on characteristic leaf clusters despite visual similarity to background vegetation.</w:t>
       </w:r>
     </w:p>
     <w:p>
@@ -4003,38 +4003,14 @@
     </w:p>
     <w:p>
       <w:pPr>
-        <w:spacing w:before="80" w:after="120"/>
+        <w:spacing w:before="80" w:after="240"/>
       </w:pPr>
       <w:r>
         <w:rPr>
           <w:i/>
           <w:sz w:val="20"/>
         </w:rPr>
-        <w:t>Fig. 9. Grad-CAM attention maps — AgroOnto-VLM on DeepWeeds. The model focuses on distinctive leaf morphology and plant structure. The Chinee Apple example shows activation concentrated on characteristic leaf clusters despite visual similarity to background vegetation.</w:t>
-      </w:r>
-    </w:p>
-    <w:p>
-      <w:pPr>
-        <w:spacing w:before="240"/>
-      </w:pPr>
-      <w:r>
-        <w:rPr>
-          <w:b/>
-          <w:color w:val="808080"/>
-        </w:rPr>
-        <w:t>[FIGURE 10 HERE]</w:t>
-      </w:r>
-    </w:p>
-    <w:p>
-      <w:pPr>
-        <w:spacing w:before="80" w:after="240"/>
-      </w:pPr>
-      <w:r>
-        <w:rPr>
-          <w:i/>
-          <w:sz w:val="20"/>
-        </w:rPr>
-        <w:t>Fig. 10. Grad-CAM attention maps — AgroOnto-VLM on IP102. Attention is concentrated on insect body features (wing patterns, body shape). Some examples show misclassification between visually similar pest species, consistent with the lower macro-F1 observed on this 102-class benchmark.</w:t>
+        <w:t>Fig. 9. Grad-CAM attention maps — AgroOnto-VLM on IP102. Attention is concentrated on insect body features (wing patterns, body shape). Some examples show misclassification between visually similar pest species, consistent with the lower macro-F1 observed on this 102-class benchmark.</w:t>
       </w:r>
     </w:p>
     <w:p>

</xml_diff>

<commit_message>
Add system architecture diagram as Fig. 1, renumber Figs 1-9 → 2-10
- Added figures/system_architecture.png: full pipeline diagram showing
  frozen ViT-B/32 backbone, LoRA adapters on last 6 blocks (r=8 α=16,
  Q/K/V/Out/MLP×2), classification head, Δ offset + logit scale τ,
  ontology similarity module (7 facets), and multi-task loss (L_cls + L_clip)
- Inserted [FIGURE 1 HERE] placeholder + Fig. 1 caption in manuscript
- Renumbered Figs 1-9 → 2-10 throughout (placeholders, captions, in-text refs)
- Added "(see Fig. 1)" citation in methodology intro paragraph
- Fixed double-increment bug in caption numbering

Co-Authored-By: Claude Sonnet 4.6 <noreply@anthropic.com>
Claude-Session: https://claude.ai/code/session_01K85NWP7R46292eL9EDr4Dm
</commit_message>
<xml_diff>
--- a/AgroOnto-VLM_Manuscript_Q1_f1.docx
+++ b/AgroOnto-VLM_Manuscript_Q1_f1.docx
@@ -134,7 +134,7 @@
         <w:rPr>
           <w:sz w:val="22"/>
         </w:rPr>
-        <w:t>We address this gap with AgroOnto-VLM. The framework combines LoRA fine-tuning of CLIP ViT-B/32 with a multi-faceted agricultural ontology that assigns seven structural facets to each class. Pairwise class similarities derived from shared facet membership are embedded into a composite training objective consisting of a soft-target cross-entropy component and a prototype regulariser. The result is a model that is trained not only to classify correctly but to fail gracefully—when it errs, its predictions tend to fall on ontologically proximate classes rather than distant ones.</w:t>
+        <w:t>We address this gap with AgroOnto-VLM. The framework combines LoRA fine-tuning of CLIP ViT-B/32 with a multi-faceted agricultural ontology (see Fig. 1) that assigns seven structural facets to each class. Pairwise class similarities derived from shared facet membership are embedded into a composite training objective consisting of a soft-target cross-entropy component and a prototype regulariser. The result is a model that is trained not only to classify correctly but to fail gracefully—when it errs, its predictions tend to fall on ontologically proximate classes rather than distant ones.</w:t>
       </w:r>
     </w:p>
     <w:p>
@@ -2871,7 +2871,7 @@
           <w:b/>
           <w:color w:val="808080"/>
         </w:rPr>
-        <w:t>[FIGURE 6 HERE]</w:t>
+        <w:t>[FIGURE 7 HERE]</w:t>
       </w:r>
     </w:p>
     <w:p>
@@ -2883,7 +2883,7 @@
           <w:i/>
           <w:sz w:val="20"/>
         </w:rPr>
-        <w:t>Fig. 6. Multi-seed reproducibility. Top-1 test accuracy (%) across three random seeds (42, 123, 456) on PlantVillage tomato, DeepWeeds, and IP102. Horizontal line: per-dataset mean. Shaded band: ±1 std.</w:t>
+        <w:t>Fig. 7. Multi-seed reproducibility. Top-1 test accuracy (%) across three random seeds (42, 123, 456) on PlantVillage tomato, DeepWeeds, and IP102. Horizontal line: per-dataset mean. Shaded band: ±1 std.</w:t>
       </w:r>
     </w:p>
     <w:p>
@@ -3660,7 +3660,7 @@
           <w:b/>
           <w:color w:val="808080"/>
         </w:rPr>
-        <w:t>[FIGURE 5 HERE]</w:t>
+        <w:t>[FIGURE 6 HERE]</w:t>
       </w:r>
     </w:p>
     <w:p>
@@ -3672,7 +3672,7 @@
           <w:i/>
           <w:sz w:val="20"/>
         </w:rPr>
-        <w:t>Fig. 5. State-of-the-art comparison. Top-1 accuracy (%) on PlantVillage tomato (PV), DeepWeeds (DW), and IP102 for AgroOnto-VLM (red) versus published baselines. Protocol differences are noted in Table 5.</w:t>
+        <w:t>Fig. 6. State-of-the-art comparison. Top-1 accuracy (%) on PlantVillage tomato (PV), DeepWeeds (DW), and IP102 for AgroOnto-VLM (red) versus published baselines. Protocol differences are noted in Table 5.</w:t>
       </w:r>
     </w:p>
     <w:p>
@@ -3695,7 +3695,32 @@
         <w:rPr>
           <w:sz w:val="22"/>
         </w:rPr>
-        <w:t>Fig. 1 shows ablation results across all three datasets as grouped bar charts comparing AgroOnto-VLM, CLIP-LoRA Baseline, −Ontology Ablation, and −LoRA Ablation.</w:t>
+        <w:t>Fig. 2 shows ablation results across all three datasets as grouped bar charts comparing AgroOnto-VLM, CLIP-LoRA Baseline, −Ontology Ablation, and −LoRA Ablation.</w:t>
+      </w:r>
+    </w:p>
+    <w:p>
+      <w:pPr>
+        <w:jc w:val="center"/>
+        <w:spacing w:before="240" w:after="0"/>
+      </w:pPr>
+      <w:r>
+        <w:rPr>
+          <w:b/>
+        </w:rPr>
+        <w:t>[FIGURE 1 HERE]</w:t>
+      </w:r>
+    </w:p>
+    <w:p>
+      <w:pPr>
+        <w:jc w:val="center"/>
+        <w:spacing w:before="60" w:after="240"/>
+      </w:pPr>
+      <w:r>
+        <w:rPr>
+          <w:i/>
+          <w:sz w:val="18"/>
+        </w:rPr>
+        <w:t xml:space="preserve">Fig. 1. System architecture of AgroOnto-VLM. An input image is divided into 196 patches and projected to a 512-d sequence by the frozen ViT-B/32 patch embedding. The sequence passes through 12 transformer blocks; LoRA adapters (rank r=8, scale α=16) are injected residually into the last 6 blocks (B7–B12), modifying Q, K, V, Out, and both MLP projections. The [CLS] token feature f_v ∈ R^512 is fed to a trainable linear head W and to a delta-augmented cosine classifier (W+Δ, learned logit scale τ). A multi-task loss combines ontology-guided soft-KL label smoothing (L_cls) with CLIP-style contrastive alignment (L_clip), where the ontology similarity matrix S encodes taxonomic relationships across 7 facets (genus, family, order, crop, symptom, pathogen type). Coloured borders indicate trainable vs. frozen components.</w:t>
       </w:r>
     </w:p>
     <w:p>
@@ -3707,7 +3732,7 @@
           <w:b/>
           <w:color w:val="808080"/>
         </w:rPr>
-        <w:t>[FIGURE 1 HERE]</w:t>
+        <w:t>[FIGURE 2 HERE]</w:t>
       </w:r>
     </w:p>
     <w:p>
@@ -3719,7 +3744,7 @@
           <w:i/>
           <w:sz w:val="20"/>
         </w:rPr>
-        <w:t>Fig. 1. Ablation study results. Grouped bars show test accuracy (%) for AgroOnto-VLM (Proposed), CLIP-LoRA Baseline (−Ontology), −Ontology Ablation (label smooth only), and −LoRA Ablation (linear probe). Left to right: PlantVillage, DeepWeeds, IP102.</w:t>
+        <w:t>Fig. 2. Ablation study results. Grouped bars show test accuracy (%) for AgroOnto-VLM (Proposed), CLIP-LoRA Baseline (−Ontology), −Ontology Ablation (label smooth only), and −LoRA Ablation (linear probe). Left to right: PlantVillage, DeepWeeds, IP102.</w:t>
       </w:r>
     </w:p>
     <w:p>
@@ -3764,7 +3789,7 @@
         <w:rPr>
           <w:sz w:val="22"/>
         </w:rPr>
-        <w:t>Fig. 2 shows training and validation loss and accuracy curves for AgroOnto-VLM across all three datasets. On PlantVillage and DeepWeeds, training loss decreases smoothly and validation accuracy plateaus within 15–20 epochs, indicating stable convergence without overfitting. On IP102, validation accuracy plateaus earlier (approximately epoch 10) while training loss continues to decrease, suggesting mild overfitting on the long-tail classes at later epochs.</w:t>
+        <w:t>Fig. 3 shows training and validation loss and accuracy curves for AgroOnto-VLM across all three datasets. On PlantVillage and DeepWeeds, training loss decreases smoothly and validation accuracy plateaus within 15–20 epochs, indicating stable convergence without overfitting. On IP102, validation accuracy plateaus earlier (approximately epoch 10) while training loss continues to decrease, suggesting mild overfitting on the long-tail classes at later epochs.</w:t>
       </w:r>
     </w:p>
     <w:p>
@@ -3776,7 +3801,7 @@
           <w:b/>
           <w:color w:val="808080"/>
         </w:rPr>
-        <w:t>[FIGURE 2 HERE]</w:t>
+        <w:t>[FIGURE 3 HERE]</w:t>
       </w:r>
     </w:p>
     <w:p>
@@ -3788,7 +3813,7 @@
           <w:i/>
           <w:sz w:val="20"/>
         </w:rPr>
-        <w:t>Fig. 2. Training convergence curves for AgroOnto-VLM. Top row: training and validation loss. Bottom row: training and validation accuracy. Columns (left to right): PlantVillage, DeepWeeds, IP102. Epoch axis: 0–30.</w:t>
+        <w:t>Fig. 3. Training convergence curves for AgroOnto-VLM. Top row: training and validation loss. Bottom row: training and validation accuracy. Columns (left to right): PlantVillage, DeepWeeds, IP102. Epoch axis: 0–30.</w:t>
       </w:r>
     </w:p>
     <w:p>
@@ -3811,7 +3836,7 @@
         <w:rPr>
           <w:sz w:val="22"/>
         </w:rPr>
-        <w:t>Fig. 3 shows normalised confusion matrices for AgroOnto-VLM on the three test sets. On PlantVillage tomato, the largest off-diagonal entry is between Tomato Late Blight and Tomato Early Blight, two classes that share host crop, organ, and symptom facets; this is the lowest-severity confusion pair in the ontology. On DeepWeeds, confusions cluster between visually similar species within the same growth-form group. On IP102, the confusion matrix is sparse at the class level but shows systematic confusion within insect order groups, consistent with the taxonomic facet structure.</w:t>
+        <w:t>Fig. 4 shows normalised confusion matrices for AgroOnto-VLM on the three test sets. On PlantVillage tomato, the largest off-diagonal entry is between Tomato Late Blight and Tomato Early Blight, two classes that share host crop, organ, and symptom facets; this is the lowest-severity confusion pair in the ontology. On DeepWeeds, confusions cluster between visually similar species within the same growth-form group. On IP102, the confusion matrix is sparse at the class level but shows systematic confusion within insect order groups, consistent with the taxonomic facet structure.</w:t>
       </w:r>
     </w:p>
     <w:p>
@@ -3823,7 +3848,7 @@
           <w:b/>
           <w:color w:val="808080"/>
         </w:rPr>
-        <w:t>[FIGURE 3 HERE]</w:t>
+        <w:t>[FIGURE 4 HERE]</w:t>
       </w:r>
     </w:p>
     <w:p>
@@ -3835,7 +3860,7 @@
           <w:i/>
           <w:sz w:val="20"/>
         </w:rPr>
-        <w:t>Fig. 3. Confusion matrices for AgroOnto-VLM. (a) PlantVillage tomato (10×10, normalised by row). (b) DeepWeeds (9×9, normalised by row). (c) IP102 (102×102, normalised by row; classes ordered by taxonomic order for readability).</w:t>
+        <w:t>Fig. 4. Confusion matrices for AgroOnto-VLM. (a) PlantVillage tomato (10×10, normalised by row). (b) DeepWeeds (9×9, normalised by row). (c) IP102 (102×102, normalised by row; classes ordered by taxonomic order for readability).</w:t>
       </w:r>
     </w:p>
     <w:p>
@@ -3858,7 +3883,7 @@
         <w:rPr>
           <w:sz w:val="22"/>
         </w:rPr>
-        <w:t>Fig. 4 reports mean misclassification severity (Eq. 8) for AgroOnto-VLM and the CLIP-LoRA baseline, stratified by disease severity group (PlantVillage) and weed threat level (DeepWeeds).</w:t>
+        <w:t>Fig. 5 reports mean misclassification severity (Eq. 8) for AgroOnto-VLM and the CLIP-LoRA baseline, stratified by disease severity group (PlantVillage) and weed threat level (DeepWeeds).</w:t>
       </w:r>
     </w:p>
     <w:p>
@@ -3870,7 +3895,7 @@
           <w:b/>
           <w:color w:val="808080"/>
         </w:rPr>
-        <w:t>[FIGURE 4 HERE]</w:t>
+        <w:t>[FIGURE 5 HERE]</w:t>
       </w:r>
     </w:p>
     <w:p>
@@ -3882,7 +3907,7 @@
           <w:i/>
           <w:sz w:val="20"/>
         </w:rPr>
-        <w:t>Fig. 4. Misclassification severity analysis. (a) PlantVillage tomato: accuracy across four disease severity strata (Healthy, Mild, Moderate, Severe). AgroOnto-VLM (blue) vs. CLIP-LoRA baseline (grey). (b) DeepWeeds: accuracy across weed threat level groups (Non-invasive, Low, Moderate, High threat). Error bars: ±1 std across three seeds.</w:t>
+        <w:t>Fig. 5. Misclassification severity analysis. (a) PlantVillage tomato: accuracy across four disease severity strata (Healthy, Mild, Moderate, Severe). AgroOnto-VLM (blue) vs. CLIP-LoRA baseline (grey). (b) DeepWeeds: accuracy across weed threat level groups (Non-invasive, Low, Moderate, High threat). Error bars: ±1 std across three seeds.</w:t>
       </w:r>
     </w:p>
     <w:p>
@@ -3950,7 +3975,7 @@
           <w:b/>
           <w:color w:val="808080"/>
         </w:rPr>
-        <w:t>[FIGURE 7 HERE]</w:t>
+        <w:t>[FIGURE 8 HERE]</w:t>
       </w:r>
     </w:p>
     <w:p>
@@ -3962,31 +3987,7 @@
           <w:i/>
           <w:sz w:val="20"/>
         </w:rPr>
-        <w:t>Fig. 7. Grad-CAM attention maps — AgroOnto-VLM on PlantVillage Tomato. Left: original images. Right: Grad-CAM overlay (red = high activation). The model correctly localises lesion regions for Early Blight, Bacterial Spot, and Tomato Yellow Leaf Curl Virus, confirming disease-specific feature discrimination.</w:t>
-      </w:r>
-    </w:p>
-    <w:p>
-      <w:pPr>
-        <w:spacing w:before="240"/>
-      </w:pPr>
-      <w:r>
-        <w:rPr>
-          <w:b/>
-          <w:color w:val="808080"/>
-        </w:rPr>
-        <w:t>[FIGURE 8 HERE]</w:t>
-      </w:r>
-    </w:p>
-    <w:p>
-      <w:pPr>
-        <w:spacing w:before="80" w:after="120"/>
-      </w:pPr>
-      <w:r>
-        <w:rPr>
-          <w:i/>
-          <w:sz w:val="20"/>
-        </w:rPr>
-        <w:t>Fig. 8. Grad-CAM attention maps — AgroOnto-VLM on DeepWeeds. The model focuses on distinctive leaf morphology and plant structure. The Chinee Apple example shows activation concentrated on characteristic leaf clusters despite visual similarity to background vegetation.</w:t>
+        <w:t>Fig. 8. Grad-CAM attention maps — AgroOnto-VLM on PlantVillage Tomato. Left: original images. Right: Grad-CAM overlay (red = high activation). The model correctly localises lesion regions for Early Blight, Bacterial Spot, and Tomato Yellow Leaf Curl Virus, confirming disease-specific feature discrimination.</w:t>
       </w:r>
     </w:p>
     <w:p>
@@ -4003,14 +4004,38 @@
     </w:p>
     <w:p>
       <w:pPr>
-        <w:spacing w:before="80" w:after="240"/>
+        <w:spacing w:before="80" w:after="120"/>
       </w:pPr>
       <w:r>
         <w:rPr>
           <w:i/>
           <w:sz w:val="20"/>
         </w:rPr>
-        <w:t>Fig. 9. Grad-CAM attention maps — AgroOnto-VLM on IP102. Attention is concentrated on insect body features (wing patterns, body shape). Some examples show misclassification between visually similar pest species, consistent with the lower macro-F1 observed on this 102-class benchmark.</w:t>
+        <w:t>Fig. 9. Grad-CAM attention maps — AgroOnto-VLM on DeepWeeds. The model focuses on distinctive leaf morphology and plant structure. The Chinee Apple example shows activation concentrated on characteristic leaf clusters despite visual similarity to background vegetation.</w:t>
+      </w:r>
+    </w:p>
+    <w:p>
+      <w:pPr>
+        <w:spacing w:before="240"/>
+      </w:pPr>
+      <w:r>
+        <w:rPr>
+          <w:b/>
+          <w:color w:val="808080"/>
+        </w:rPr>
+        <w:t>[FIGURE 10 HERE]</w:t>
+      </w:r>
+    </w:p>
+    <w:p>
+      <w:pPr>
+        <w:spacing w:before="80" w:after="240"/>
+      </w:pPr>
+      <w:r>
+        <w:rPr>
+          <w:i/>
+          <w:sz w:val="20"/>
+        </w:rPr>
+        <w:t>Fig. 10. Grad-CAM attention maps — AgroOnto-VLM on IP102. Attention is concentrated on insect body features (wing patterns, body shape). Some examples show misclassification between visually similar pest species, consistent with the lower macro-F1 observed on this 102-class benchmark.</w:t>
       </w:r>
     </w:p>
     <w:p>

</xml_diff>